<commit_message>
Update National Advisory Committee institution names to standard short-forms (IIT, NSUT, JNU, GGSIPU, IIIT)
</commit_message>
<xml_diff>
--- a/ICNGCI_2027_Committee_Members.docx
+++ b/ICNGCI_2027_Committee_Members.docx
@@ -43,7 +43,7 @@
         </w:rPr>
         <w:t>Sharda University, Greater Noida, India · 19–20 February 2027</w:t>
         <w:br/>
-        <w:t>Complete Committee Directory (Designations, Departments, Roles &amp; Universities)</w:t>
+        <w:t>Complete Committee Directory (Designations, Departments, Roles &amp; Institutions)</w:t>
       </w:r>
     </w:p>
     <w:p>
@@ -2453,7 +2453,7 @@
                 <w:color w:val="0F4C81"/>
                 <w:sz w:val="15"/>
               </w:rPr>
-              <w:t>Associate Professor</w:t>
+              <w:t>Associate Professor &amp; Associate Dean</w:t>
             </w:r>
           </w:p>
         </w:tc>
@@ -2497,7 +2497,7 @@
                 <w:color w:val="64748B"/>
                 <w:sz w:val="15"/>
               </w:rPr>
-              <w:t>Conference Chairs · Conference Chair · Associate Dean</w:t>
+              <w:t>Conference Chairs · Conference Chair</w:t>
             </w:r>
           </w:p>
         </w:tc>
@@ -2567,7 +2567,7 @@
                 <w:color w:val="0F4C81"/>
                 <w:sz w:val="15"/>
               </w:rPr>
-              <w:t>Professor</w:t>
+              <w:t>Professor &amp; Associate Dean</w:t>
             </w:r>
           </w:p>
         </w:tc>
@@ -2611,7 +2611,7 @@
                 <w:color w:val="64748B"/>
                 <w:sz w:val="15"/>
               </w:rPr>
-              <w:t>Conference Chairs · Conference Chair · Associate Dean</w:t>
+              <w:t>Conference Chairs · Conference Chair</w:t>
             </w:r>
           </w:p>
         </w:tc>
@@ -2681,7 +2681,7 @@
                 <w:color w:val="0F4C81"/>
                 <w:sz w:val="15"/>
               </w:rPr>
-              <w:t>Professor &amp; Dean</w:t>
+              <w:t>Professor &amp; Head of Department</w:t>
             </w:r>
           </w:p>
         </w:tc>
@@ -2725,7 +2725,7 @@
                 <w:color w:val="64748B"/>
                 <w:sz w:val="15"/>
               </w:rPr>
-              <w:t>Conference Chairs · Conference Chair · Head of Department</w:t>
+              <w:t>Conference Chairs · Conference Chair</w:t>
             </w:r>
           </w:p>
         </w:tc>
@@ -2795,7 +2795,7 @@
                 <w:color w:val="0F4C81"/>
                 <w:sz w:val="15"/>
               </w:rPr>
-              <w:t>Associate Professor</w:t>
+              <w:t>Associate Professor &amp; Head of Department</w:t>
             </w:r>
           </w:p>
         </w:tc>
@@ -2839,7 +2839,7 @@
                 <w:color w:val="64748B"/>
                 <w:sz w:val="15"/>
               </w:rPr>
-              <w:t>Conference Chairs · Conference Chair · Head of Department</w:t>
+              <w:t>Conference Chairs · Conference Chair</w:t>
             </w:r>
           </w:p>
         </w:tc>
@@ -5505,7 +5505,9 @@
                 <w:color w:val="0F4C81"/>
                 <w:sz w:val="15"/>
               </w:rPr>
-              <w:t>Member of the International Advisory Committee/Technical Program Committee for the ICNGCI</w:t>
+              <w:t>Member of the International Advisory Committee/Technical Program Committee</w:t>
+              <w:br/>
+              <w:t xml:space="preserve">                      for the ICNGCI</w:t>
             </w:r>
           </w:p>
         </w:tc>
@@ -6464,7 +6466,7 @@
                 <w:color w:val="0F4C81"/>
                 <w:sz w:val="15"/>
               </w:rPr>
-              <w:t>Honorary Professor, Dept of Electrical Engineering</w:t>
+              <w:t>Honorary Professor</w:t>
             </w:r>
           </w:p>
         </w:tc>
@@ -6486,6 +6488,7 @@
                 <w:color w:val="475569"/>
                 <w:sz w:val="15"/>
               </w:rPr>
+              <w:t>Department of Electrical Engineering</w:t>
             </w:r>
           </w:p>
         </w:tc>
@@ -6529,7 +6532,7 @@
                 <w:color w:val="1E293B"/>
                 <w:sz w:val="15"/>
               </w:rPr>
-              <w:t>Indian Institute of Technology, Delhi</w:t>
+              <w:t>IIT Delhi</w:t>
             </w:r>
           </w:p>
         </w:tc>
@@ -6599,6 +6602,7 @@
                 <w:color w:val="475569"/>
                 <w:sz w:val="15"/>
               </w:rPr>
+              <w:t>Department of Computer Science &amp; Engineering</w:t>
             </w:r>
           </w:p>
         </w:tc>
@@ -6690,7 +6694,7 @@
                 <w:color w:val="0F4C81"/>
                 <w:sz w:val="15"/>
               </w:rPr>
-              <w:t>Professor, Computer Science and Engineering</w:t>
+              <w:t>Professor</w:t>
             </w:r>
           </w:p>
         </w:tc>
@@ -6712,6 +6716,7 @@
                 <w:color w:val="475569"/>
                 <w:sz w:val="15"/>
               </w:rPr>
+              <w:t>Department of Computer Science and Engineering</w:t>
             </w:r>
           </w:p>
         </w:tc>
@@ -6867,6 +6872,7 @@
                 <w:color w:val="1E293B"/>
                 <w:sz w:val="15"/>
               </w:rPr>
+              <w:t>IIT Mandi</w:t>
             </w:r>
           </w:p>
         </w:tc>
@@ -6978,6 +6984,7 @@
                 <w:color w:val="1E293B"/>
                 <w:sz w:val="15"/>
               </w:rPr>
+              <w:t>IIT Bhubaneswar</w:t>
             </w:r>
           </w:p>
         </w:tc>
@@ -7047,7 +7054,7 @@
                 <w:color w:val="475569"/>
                 <w:sz w:val="15"/>
               </w:rPr>
-              <w:t>Department of Electronics Engg.</w:t>
+              <w:t>Department of Electronics Engineering</w:t>
             </w:r>
           </w:p>
         </w:tc>
@@ -7069,7 +7076,7 @@
                 <w:color w:val="64748B"/>
                 <w:sz w:val="15"/>
               </w:rPr>
-              <w:t>National Advisory Committee · IIT BHU</w:t>
+              <w:t>National Advisory Committee · IIT (BHU) Varanasi</w:t>
             </w:r>
           </w:p>
         </w:tc>
@@ -7091,7 +7098,7 @@
                 <w:color w:val="1E293B"/>
                 <w:sz w:val="15"/>
               </w:rPr>
-              <w:t>Indian Institute of Technology (BHU), Varanasi</w:t>
+              <w:t>IIT (BHU) Varanasi</w:t>
             </w:r>
           </w:p>
         </w:tc>
@@ -7203,6 +7210,7 @@
                 <w:color w:val="1E293B"/>
                 <w:sz w:val="15"/>
               </w:rPr>
+              <w:t>IIT Guwahati</w:t>
             </w:r>
           </w:p>
         </w:tc>
@@ -7272,7 +7280,7 @@
                 <w:color w:val="475569"/>
                 <w:sz w:val="15"/>
               </w:rPr>
-              <w:t>Department of Computer Science &amp; Engg.</w:t>
+              <w:t>Department of Computer Science &amp; Engineering</w:t>
             </w:r>
           </w:p>
         </w:tc>
@@ -7294,7 +7302,7 @@
                 <w:color w:val="64748B"/>
                 <w:sz w:val="15"/>
               </w:rPr>
-              <w:t>National Advisory Committee · IIT(ISM) Dhanbad</w:t>
+              <w:t>National Advisory Committee · IIT (ISM) Dhanbad</w:t>
             </w:r>
           </w:p>
         </w:tc>
@@ -7316,7 +7324,7 @@
                 <w:color w:val="1E293B"/>
                 <w:sz w:val="15"/>
               </w:rPr>
-              <w:t>IIT(ISM) Dhanbad</w:t>
+              <w:t>IIT (ISM) Dhanbad</w:t>
             </w:r>
           </w:p>
         </w:tc>
@@ -7428,6 +7436,7 @@
                 <w:color w:val="1E293B"/>
                 <w:sz w:val="15"/>
               </w:rPr>
+              <w:t>IIT Mandi</w:t>
             </w:r>
           </w:p>
         </w:tc>
@@ -7539,6 +7548,7 @@
                 <w:color w:val="1E293B"/>
                 <w:sz w:val="15"/>
               </w:rPr>
+              <w:t>IIT Guwahati</w:t>
             </w:r>
           </w:p>
         </w:tc>
@@ -7650,6 +7660,7 @@
                 <w:color w:val="1E293B"/>
                 <w:sz w:val="15"/>
               </w:rPr>
+              <w:t>IIT Bhubaneswar</w:t>
             </w:r>
           </w:p>
         </w:tc>
@@ -7697,7 +7708,7 @@
                 <w:color w:val="0F4C81"/>
                 <w:sz w:val="15"/>
               </w:rPr>
-              <w:t>Director &amp; Professor</w:t>
+              <w:t>Ex-Professor</w:t>
             </w:r>
           </w:p>
         </w:tc>
@@ -7719,7 +7730,7 @@
                 <w:color w:val="475569"/>
                 <w:sz w:val="15"/>
               </w:rPr>
-              <w:t>School of Computer Science and Engineering</w:t>
+              <w:t>Department of Electrical Engineering</w:t>
             </w:r>
           </w:p>
         </w:tc>
@@ -7741,7 +7752,7 @@
                 <w:color w:val="64748B"/>
                 <w:sz w:val="15"/>
               </w:rPr>
-              <w:t>National Advisory Committee · IIT BHU</w:t>
+              <w:t>National Advisory Committee · IIT (BHU) Varanasi</w:t>
             </w:r>
           </w:p>
         </w:tc>
@@ -7763,7 +7774,7 @@
                 <w:color w:val="1E293B"/>
                 <w:sz w:val="15"/>
               </w:rPr>
-              <w:t>Sharda University, Greater Noida, India</w:t>
+              <w:t>IIT (BHU) Varanasi</w:t>
             </w:r>
           </w:p>
         </w:tc>
@@ -7855,7 +7866,7 @@
                 <w:color w:val="64748B"/>
                 <w:sz w:val="15"/>
               </w:rPr>
-              <w:t>National Advisory Committee · IIT(ISM) Dhanbad</w:t>
+              <w:t>National Advisory Committee · IIT (ISM) Dhanbad</w:t>
             </w:r>
           </w:p>
         </w:tc>
@@ -7877,7 +7888,7 @@
                 <w:color w:val="1E293B"/>
                 <w:sz w:val="15"/>
               </w:rPr>
-              <w:t>Indian Institute of Technology (Indian School of Mines) Dhanbad</w:t>
+              <w:t>IIT (ISM) Dhanbad</w:t>
             </w:r>
           </w:p>
         </w:tc>
@@ -7925,7 +7936,7 @@
                 <w:color w:val="0F4C81"/>
                 <w:sz w:val="15"/>
               </w:rPr>
-              <w:t>Professor of Electrical Engineering</w:t>
+              <w:t>Professor</w:t>
             </w:r>
           </w:p>
         </w:tc>
@@ -7947,6 +7958,7 @@
                 <w:color w:val="475569"/>
                 <w:sz w:val="15"/>
               </w:rPr>
+              <w:t>Department of Electrical Engineering</w:t>
             </w:r>
           </w:p>
         </w:tc>
@@ -7968,7 +7980,7 @@
                 <w:color w:val="64748B"/>
                 <w:sz w:val="15"/>
               </w:rPr>
-              <w:t>National Advisory Committee · IIT BHU</w:t>
+              <w:t>National Advisory Committee · IIT (BHU) Varanasi</w:t>
             </w:r>
           </w:p>
         </w:tc>
@@ -7990,7 +8002,7 @@
                 <w:color w:val="1E293B"/>
                 <w:sz w:val="15"/>
               </w:rPr>
-              <w:t>Indian Institute of Technology (BHU)</w:t>
+              <w:t>IIT (BHU) Varanasi</w:t>
             </w:r>
           </w:p>
         </w:tc>
@@ -8082,7 +8094,7 @@
                 <w:color w:val="64748B"/>
                 <w:sz w:val="15"/>
               </w:rPr>
-              <w:t>National Advisory Committee · IIT(ISM) Dhanbad</w:t>
+              <w:t>National Advisory Committee · IIT (ISM) Dhanbad</w:t>
             </w:r>
           </w:p>
         </w:tc>
@@ -8104,7 +8116,7 @@
                 <w:color w:val="1E293B"/>
                 <w:sz w:val="15"/>
               </w:rPr>
-              <w:t>Indian Institute of Technology (ISM) Dhanbad</w:t>
+              <w:t>IIT (ISM) Dhanbad</w:t>
             </w:r>
           </w:p>
         </w:tc>
@@ -8196,7 +8208,7 @@
                 <w:color w:val="64748B"/>
                 <w:sz w:val="15"/>
               </w:rPr>
-              <w:t>National Advisory Committee · IIT BHU</w:t>
+              <w:t>National Advisory Committee · IIT (BHU) Varanasi</w:t>
             </w:r>
           </w:p>
         </w:tc>
@@ -8218,7 +8230,7 @@
                 <w:color w:val="1E293B"/>
                 <w:sz w:val="15"/>
               </w:rPr>
-              <w:t>Indian Institute of Technology (BHU), Varanasi (UP)</w:t>
+              <w:t>IIT (BHU) Varanasi</w:t>
             </w:r>
           </w:p>
         </w:tc>
@@ -8310,7 +8322,7 @@
                 <w:color w:val="64748B"/>
                 <w:sz w:val="15"/>
               </w:rPr>
-              <w:t>National Advisory Committee · IIT(ISM) Dhanbad</w:t>
+              <w:t>National Advisory Committee · IIT (ISM) Dhanbad</w:t>
             </w:r>
           </w:p>
         </w:tc>
@@ -8332,7 +8344,7 @@
                 <w:color w:val="1E293B"/>
                 <w:sz w:val="15"/>
               </w:rPr>
-              <w:t>Indian Institute of Technology(Indian School of Mines),Dhanbad</w:t>
+              <w:t>IIT (ISM) Dhanbad</w:t>
             </w:r>
           </w:p>
         </w:tc>
@@ -8380,7 +8392,7 @@
                 <w:color w:val="0F4C81"/>
                 <w:sz w:val="15"/>
               </w:rPr>
-              <w:t>Director &amp; Professor</w:t>
+              <w:t>Professor</w:t>
             </w:r>
           </w:p>
         </w:tc>
@@ -8402,7 +8414,7 @@
                 <w:color w:val="475569"/>
                 <w:sz w:val="15"/>
               </w:rPr>
-              <w:t>School of Computer Science and Engineering</w:t>
+              <w:t>Department of Electronics Engineering</w:t>
             </w:r>
           </w:p>
         </w:tc>
@@ -8424,7 +8436,7 @@
                 <w:color w:val="64748B"/>
                 <w:sz w:val="15"/>
               </w:rPr>
-              <w:t>National Advisory Committee · IIT BHU</w:t>
+              <w:t>National Advisory Committee · IIT (BHU) Varanasi</w:t>
             </w:r>
           </w:p>
         </w:tc>
@@ -8446,7 +8458,7 @@
                 <w:color w:val="1E293B"/>
                 <w:sz w:val="15"/>
               </w:rPr>
-              <w:t>Sharda University, Greater Noida, India</w:t>
+              <w:t>IIT (BHU) Varanasi</w:t>
             </w:r>
           </w:p>
         </w:tc>
@@ -8516,7 +8528,7 @@
                 <w:color w:val="475569"/>
                 <w:sz w:val="15"/>
               </w:rPr>
-              <w:t>Department of CSE</w:t>
+              <w:t>Department of Computer Science &amp; Engineering</w:t>
             </w:r>
           </w:p>
         </w:tc>
@@ -8538,7 +8550,7 @@
                 <w:color w:val="64748B"/>
                 <w:sz w:val="15"/>
               </w:rPr>
-              <w:t>National Advisory Committee · IIT Dhanbad</w:t>
+              <w:t>National Advisory Committee · IIT (ISM) Dhanbad</w:t>
             </w:r>
           </w:p>
         </w:tc>
@@ -8560,7 +8572,7 @@
                 <w:color w:val="1E293B"/>
                 <w:sz w:val="15"/>
               </w:rPr>
-              <w:t>IIT Dhanbad</w:t>
+              <w:t>IIT (ISM) Dhanbad</w:t>
             </w:r>
           </w:p>
         </w:tc>
@@ -8652,7 +8664,7 @@
                 <w:color w:val="64748B"/>
                 <w:sz w:val="15"/>
               </w:rPr>
-              <w:t>National Advisory Committee · IIT BHU</w:t>
+              <w:t>National Advisory Committee · IIT (BHU) Varanasi</w:t>
             </w:r>
           </w:p>
         </w:tc>
@@ -8674,7 +8686,7 @@
                 <w:color w:val="1E293B"/>
                 <w:sz w:val="15"/>
               </w:rPr>
-              <w:t>Indian Institute of Technology (BHU), Varanasi</w:t>
+              <w:t>IIT (BHU) Varanasi</w:t>
             </w:r>
           </w:p>
         </w:tc>
@@ -8744,7 +8756,7 @@
                 <w:color w:val="475569"/>
                 <w:sz w:val="15"/>
               </w:rPr>
-              <w:t>Dept. of Comp. Sc. &amp; Engg.</w:t>
+              <w:t>Department of Computer Science &amp; Engineering</w:t>
             </w:r>
           </w:p>
         </w:tc>
@@ -8766,7 +8778,7 @@
                 <w:color w:val="64748B"/>
                 <w:sz w:val="15"/>
               </w:rPr>
-              <w:t>National Advisory Committee · IIT(ISM) Dhanbad</w:t>
+              <w:t>National Advisory Committee · IIT (ISM) Dhanbad</w:t>
             </w:r>
           </w:p>
         </w:tc>
@@ -8880,7 +8892,7 @@
                 <w:color w:val="64748B"/>
                 <w:sz w:val="15"/>
               </w:rPr>
-              <w:t>National Advisory Committee · IIT BHU</w:t>
+              <w:t>National Advisory Committee · IIT (BHU) Varanasi</w:t>
             </w:r>
           </w:p>
         </w:tc>
@@ -8902,7 +8914,7 @@
                 <w:color w:val="1E293B"/>
                 <w:sz w:val="15"/>
               </w:rPr>
-              <w:t>Indian Institute of Technology (BHU) Varanasi</w:t>
+              <w:t>IIT (BHU) Varanasi</w:t>
             </w:r>
           </w:p>
         </w:tc>
@@ -8994,7 +9006,7 @@
                 <w:color w:val="64748B"/>
                 <w:sz w:val="15"/>
               </w:rPr>
-              <w:t>National Advisory Committee · IIT(ISM) Dhanbad</w:t>
+              <w:t>National Advisory Committee · IIT (ISM) Dhanbad</w:t>
             </w:r>
           </w:p>
         </w:tc>
@@ -9064,7 +9076,7 @@
                 <w:color w:val="0F4C81"/>
                 <w:sz w:val="15"/>
               </w:rPr>
-              <w:t>Professor of Electrical engineering</w:t>
+              <w:t>Professor</w:t>
             </w:r>
           </w:p>
         </w:tc>
@@ -9086,6 +9098,7 @@
                 <w:color w:val="475569"/>
                 <w:sz w:val="15"/>
               </w:rPr>
+              <w:t>Department of Electrical Engineering</w:t>
             </w:r>
           </w:p>
         </w:tc>
@@ -9107,7 +9120,7 @@
                 <w:color w:val="64748B"/>
                 <w:sz w:val="15"/>
               </w:rPr>
-              <w:t>National Advisory Committee · IIT BHU</w:t>
+              <w:t>National Advisory Committee · IIT (BHU) Varanasi</w:t>
             </w:r>
           </w:p>
         </w:tc>
@@ -9129,7 +9142,7 @@
                 <w:color w:val="1E293B"/>
                 <w:sz w:val="15"/>
               </w:rPr>
-              <w:t>Indian Institute of Technology (BHU) Varanasi</w:t>
+              <w:t>IIT (BHU) Varanasi</w:t>
             </w:r>
           </w:p>
         </w:tc>
@@ -9177,7 +9190,7 @@
                 <w:color w:val="0F4C81"/>
                 <w:sz w:val="15"/>
               </w:rPr>
-              <w:t>Associate Professor,  IEEE Senior Member</w:t>
+              <w:t>Associate Professor</w:t>
             </w:r>
           </w:p>
         </w:tc>
@@ -9221,7 +9234,7 @@
                 <w:color w:val="64748B"/>
                 <w:sz w:val="15"/>
               </w:rPr>
-              <w:t>National Advisory Committee · IIT(ISM) Dhanbad</w:t>
+              <w:t>National Advisory Committee · IIT (ISM) Dhanbad</w:t>
             </w:r>
           </w:p>
         </w:tc>
@@ -9243,7 +9256,7 @@
                 <w:color w:val="1E293B"/>
                 <w:sz w:val="15"/>
               </w:rPr>
-              <w:t>IIT(ISM) Dhanbad.</w:t>
+              <w:t>IIT (ISM) Dhanbad</w:t>
             </w:r>
           </w:p>
         </w:tc>
@@ -9291,7 +9304,7 @@
                 <w:color w:val="0F4C81"/>
                 <w:sz w:val="15"/>
               </w:rPr>
-              <w:t>Prof (HAG), Electrical engineering</w:t>
+              <w:t>Professor (HAG)</w:t>
             </w:r>
           </w:p>
         </w:tc>
@@ -9313,6 +9326,7 @@
                 <w:color w:val="475569"/>
                 <w:sz w:val="15"/>
               </w:rPr>
+              <w:t>Department of Electrical Engineering</w:t>
             </w:r>
           </w:p>
         </w:tc>
@@ -9334,7 +9348,7 @@
                 <w:color w:val="64748B"/>
                 <w:sz w:val="15"/>
               </w:rPr>
-              <w:t>National Advisory Committee · IIT BHU</w:t>
+              <w:t>National Advisory Committee · IIT (BHU) Varanasi</w:t>
             </w:r>
           </w:p>
         </w:tc>
@@ -9356,7 +9370,7 @@
                 <w:color w:val="1E293B"/>
                 <w:sz w:val="15"/>
               </w:rPr>
-              <w:t>Indian Institute of Technology, Banaras Hindu University, Varanasi</w:t>
+              <w:t>IIT (BHU) Varanasi</w:t>
             </w:r>
           </w:p>
         </w:tc>
@@ -9581,6 +9595,7 @@
                 <w:color w:val="1E293B"/>
                 <w:sz w:val="15"/>
               </w:rPr>
+              <w:t>IIT Ropar</w:t>
             </w:r>
           </w:p>
         </w:tc>
@@ -9694,7 +9709,7 @@
                 <w:color w:val="1E293B"/>
                 <w:sz w:val="15"/>
               </w:rPr>
-              <w:t>Jawaharlal Nehru University, New Delhi</w:t>
+              <w:t>JNU New Delhi</w:t>
             </w:r>
           </w:p>
         </w:tc>
@@ -9808,7 +9823,7 @@
                 <w:color w:val="1E293B"/>
                 <w:sz w:val="15"/>
               </w:rPr>
-              <w:t>Jawaharlal Nehru University, New Delhi</w:t>
+              <w:t>JNU New Delhi</w:t>
             </w:r>
           </w:p>
         </w:tc>
@@ -9856,7 +9871,7 @@
                 <w:color w:val="0F4C81"/>
                 <w:sz w:val="15"/>
               </w:rPr>
-              <w:t>University</w:t>
+              <w:t>Professor</w:t>
             </w:r>
           </w:p>
         </w:tc>
@@ -9878,7 +9893,7 @@
                 <w:color w:val="475569"/>
                 <w:sz w:val="15"/>
               </w:rPr>
-              <w:t>School of Information</w:t>
+              <w:t>University School of Information, Communication &amp; Technology</w:t>
             </w:r>
           </w:p>
         </w:tc>
@@ -9922,7 +9937,7 @@
                 <w:color w:val="1E293B"/>
                 <w:sz w:val="15"/>
               </w:rPr>
-              <w:t>Guru Gobind Singh Indraprastha University, Delhi</w:t>
+              <w:t>GGSIPU New Delhi</w:t>
             </w:r>
           </w:p>
         </w:tc>
@@ -9970,7 +9985,7 @@
                 <w:color w:val="0F4C81"/>
                 <w:sz w:val="15"/>
               </w:rPr>
-              <w:t>Professor, University</w:t>
+              <w:t>Professor</w:t>
             </w:r>
           </w:p>
         </w:tc>
@@ -9992,7 +10007,7 @@
                 <w:color w:val="475569"/>
                 <w:sz w:val="15"/>
               </w:rPr>
-              <w:t>School of ICT</w:t>
+              <w:t>University School of ICT</w:t>
             </w:r>
           </w:p>
         </w:tc>
@@ -10036,7 +10051,7 @@
                 <w:color w:val="1E293B"/>
                 <w:sz w:val="15"/>
               </w:rPr>
-              <w:t>Guru Gobind Singh Indraprastha University, New Delhi</w:t>
+              <w:t>GGSIPU New Delhi</w:t>
             </w:r>
           </w:p>
         </w:tc>
@@ -10150,7 +10165,7 @@
                 <w:color w:val="1E293B"/>
                 <w:sz w:val="15"/>
               </w:rPr>
-              <w:t>Netaji Subhas University of Technology East Campus, New Delhi</w:t>
+              <w:t>NSUT East Campus, New Delhi</w:t>
             </w:r>
           </w:p>
         </w:tc>
@@ -10198,7 +10213,7 @@
                 <w:color w:val="0F4C81"/>
                 <w:sz w:val="15"/>
               </w:rPr>
-              <w:t>Professor in the</w:t>
+              <w:t>Professor</w:t>
             </w:r>
           </w:p>
         </w:tc>
@@ -10264,7 +10279,7 @@
                 <w:color w:val="1E293B"/>
                 <w:sz w:val="15"/>
               </w:rPr>
-              <w:t>Netaji Subhas University of Technology, New Delhi</w:t>
+              <w:t>NSUT New Delhi</w:t>
             </w:r>
           </w:p>
         </w:tc>
@@ -10376,6 +10391,7 @@
                 <w:color w:val="1E293B"/>
                 <w:sz w:val="15"/>
               </w:rPr>
+              <w:t>Jamia Hamdard New Delhi</w:t>
             </w:r>
           </w:p>
         </w:tc>
@@ -10488,7 +10504,7 @@
                 <w:color w:val="1E293B"/>
                 <w:sz w:val="15"/>
               </w:rPr>
-              <w:t>Indian Institute of Information Technology Kalyani</w:t>
+              <w:t>IIIT Kalyani</w:t>
             </w:r>
           </w:p>
         </w:tc>

</xml_diff>

<commit_message>
Complete official academic designations and departments for all 37 National Advisory Committee members
</commit_message>
<xml_diff>
--- a/ICNGCI_2027_Committee_Members.docx
+++ b/ICNGCI_2027_Committee_Members.docx
@@ -6808,6 +6808,7 @@
                 <w:color w:val="0F4C81"/>
                 <w:sz w:val="15"/>
               </w:rPr>
+              <w:t>Assistant Professor</w:t>
             </w:r>
           </w:p>
         </w:tc>
@@ -6829,6 +6830,7 @@
                 <w:color w:val="475569"/>
                 <w:sz w:val="15"/>
               </w:rPr>
+              <w:t>School of Computing and Electrical Engineering</w:t>
             </w:r>
           </w:p>
         </w:tc>
@@ -6920,6 +6922,7 @@
                 <w:color w:val="0F4C81"/>
                 <w:sz w:val="15"/>
               </w:rPr>
+              <w:t>Associate Professor</w:t>
             </w:r>
           </w:p>
         </w:tc>
@@ -6941,6 +6944,7 @@
                 <w:color w:val="475569"/>
                 <w:sz w:val="15"/>
               </w:rPr>
+              <w:t>School of Electrical and Computer Sciences</w:t>
             </w:r>
           </w:p>
         </w:tc>
@@ -7146,6 +7150,7 @@
                 <w:color w:val="0F4C81"/>
                 <w:sz w:val="15"/>
               </w:rPr>
+              <w:t>Associate Professor</w:t>
             </w:r>
           </w:p>
         </w:tc>
@@ -7167,6 +7172,7 @@
                 <w:color w:val="475569"/>
                 <w:sz w:val="15"/>
               </w:rPr>
+              <w:t>Department of Electronics and Electrical Engineering</w:t>
             </w:r>
           </w:p>
         </w:tc>
@@ -7372,6 +7378,7 @@
                 <w:color w:val="0F4C81"/>
                 <w:sz w:val="15"/>
               </w:rPr>
+              <w:t>Professor</w:t>
             </w:r>
           </w:p>
         </w:tc>
@@ -7393,6 +7400,7 @@
                 <w:color w:val="475569"/>
                 <w:sz w:val="15"/>
               </w:rPr>
+              <w:t>School of Computing and Electrical Engineering</w:t>
             </w:r>
           </w:p>
         </w:tc>
@@ -7484,6 +7492,7 @@
                 <w:color w:val="0F4C81"/>
                 <w:sz w:val="15"/>
               </w:rPr>
+              <w:t>Associate Professor</w:t>
             </w:r>
           </w:p>
         </w:tc>
@@ -7505,6 +7514,7 @@
                 <w:color w:val="475569"/>
                 <w:sz w:val="15"/>
               </w:rPr>
+              <w:t>Department of Electronics and Electrical Engineering</w:t>
             </w:r>
           </w:p>
         </w:tc>
@@ -7596,6 +7606,7 @@
                 <w:color w:val="0F4C81"/>
                 <w:sz w:val="15"/>
               </w:rPr>
+              <w:t>Assistant Professor</w:t>
             </w:r>
           </w:p>
         </w:tc>
@@ -7617,6 +7628,7 @@
                 <w:color w:val="475569"/>
                 <w:sz w:val="15"/>
               </w:rPr>
+              <w:t>School of Electrical and Computer Sciences</w:t>
             </w:r>
           </w:p>
         </w:tc>
@@ -9418,7 +9430,7 @@
                 <w:color w:val="0F4C81"/>
                 <w:sz w:val="15"/>
               </w:rPr>
-              <w:t>Professor</w:t>
+              <w:t>Professor &amp; Head</w:t>
             </w:r>
           </w:p>
         </w:tc>
@@ -9440,6 +9452,7 @@
                 <w:color w:val="475569"/>
                 <w:sz w:val="15"/>
               </w:rPr>
+              <w:t>Department of Electrical Engineering</w:t>
             </w:r>
           </w:p>
         </w:tc>
@@ -9531,6 +9544,7 @@
                 <w:color w:val="0F4C81"/>
                 <w:sz w:val="15"/>
               </w:rPr>
+              <w:t>Associate Professor</w:t>
             </w:r>
           </w:p>
         </w:tc>
@@ -9552,6 +9566,7 @@
                 <w:color w:val="475569"/>
                 <w:sz w:val="15"/>
               </w:rPr>
+              <w:t>Department of Electrical Engineering</w:t>
             </w:r>
           </w:p>
         </w:tc>
@@ -10165,7 +10180,7 @@
                 <w:color w:val="1E293B"/>
                 <w:sz w:val="15"/>
               </w:rPr>
-              <w:t>NSUT East Campus, New Delhi</w:t>
+              <w:t>NSUT New Delhi</w:t>
             </w:r>
           </w:p>
         </w:tc>
@@ -10327,6 +10342,7 @@
                 <w:color w:val="0F4C81"/>
                 <w:sz w:val="15"/>
               </w:rPr>
+              <w:t>Assistant Professor</w:t>
             </w:r>
           </w:p>
         </w:tc>
@@ -10348,6 +10364,7 @@
                 <w:color w:val="475569"/>
                 <w:sz w:val="15"/>
               </w:rPr>
+              <w:t>Department of Computer Science and Engineering</w:t>
             </w:r>
           </w:p>
         </w:tc>
@@ -10461,6 +10478,7 @@
                 <w:color w:val="475569"/>
                 <w:sz w:val="15"/>
               </w:rPr>
+              <w:t>Department of Computer Science and Engineering</w:t>
             </w:r>
           </w:p>
         </w:tc>
@@ -10552,7 +10570,7 @@
                 <w:color w:val="0F4C81"/>
                 <w:sz w:val="15"/>
               </w:rPr>
-              <w:t>Assistant Professor of Computer Science</w:t>
+              <w:t>Assistant Professor</w:t>
             </w:r>
           </w:p>
         </w:tc>
@@ -10574,6 +10592,7 @@
                 <w:color w:val="475569"/>
                 <w:sz w:val="15"/>
               </w:rPr>
+              <w:t>Department of Computer Science</w:t>
             </w:r>
           </w:p>
         </w:tc>

</xml_diff>

<commit_message>
Add searched academic designations and departments for university members not in Excel
</commit_message>
<xml_diff>
--- a/ICNGCI_2027_Committee_Members.docx
+++ b/ICNGCI_2027_Committee_Members.docx
@@ -1051,6 +1051,7 @@
                 <w:color w:val="0F4C81"/>
                 <w:sz w:val="15"/>
               </w:rPr>
+              <w:t>Professor</w:t>
             </w:r>
           </w:p>
         </w:tc>
@@ -1072,6 +1073,7 @@
                 <w:color w:val="475569"/>
                 <w:sz w:val="15"/>
               </w:rPr>
+              <w:t>Artificial Intelligence Research Center (AIRC)</w:t>
             </w:r>
           </w:p>
         </w:tc>
@@ -1115,7 +1117,7 @@
                 <w:color w:val="1E293B"/>
                 <w:sz w:val="15"/>
               </w:rPr>
-              <w:t>Artificial Intelligence Research Center (AIRC), Ajman University, United Arab EmiratesFederal University of Piauí (UFPI), Teresina - PI, Brazil</w:t>
+              <w:t>Ajman University, UAE / Federal University of Piauí (UFPI), Brazil</w:t>
             </w:r>
           </w:p>
         </w:tc>
@@ -1163,6 +1165,7 @@
                 <w:color w:val="0F4C81"/>
                 <w:sz w:val="15"/>
               </w:rPr>
+              <w:t>Professor &amp; Dean</w:t>
             </w:r>
           </w:p>
         </w:tc>
@@ -1184,6 +1187,7 @@
                 <w:color w:val="475569"/>
                 <w:sz w:val="15"/>
               </w:rPr>
+              <w:t>School of Computing and Information Technology</w:t>
             </w:r>
           </w:p>
         </w:tc>
@@ -1227,7 +1231,7 @@
                 <w:color w:val="1E293B"/>
                 <w:sz w:val="15"/>
               </w:rPr>
-              <w:t>Eastern International University</w:t>
+              <w:t>Eastern International University, Vietnam</w:t>
             </w:r>
           </w:p>
         </w:tc>
@@ -1275,6 +1279,7 @@
                 <w:color w:val="0F4C81"/>
                 <w:sz w:val="15"/>
               </w:rPr>
+              <w:t>Professor of Information Technology</w:t>
             </w:r>
           </w:p>
         </w:tc>
@@ -1296,6 +1301,7 @@
                 <w:color w:val="475569"/>
                 <w:sz w:val="15"/>
               </w:rPr>
+              <w:t>School of Information Systems and Management</w:t>
             </w:r>
           </w:p>
         </w:tc>
@@ -1339,7 +1345,7 @@
                 <w:color w:val="1E293B"/>
                 <w:sz w:val="15"/>
               </w:rPr>
-              <w:t>University of South Florida</w:t>
+              <w:t>University of South Florida, USA</w:t>
             </w:r>
           </w:p>
         </w:tc>
@@ -5505,9 +5511,6 @@
                 <w:color w:val="0F4C81"/>
                 <w:sz w:val="15"/>
               </w:rPr>
-              <w:t>Member of the International Advisory Committee/Technical Program Committee</w:t>
-              <w:br/>
-              <w:t xml:space="preserve">                      for the ICNGCI</w:t>
             </w:r>
           </w:p>
         </w:tc>
@@ -11998,6 +12001,7 @@
                 <w:color w:val="0F4C81"/>
                 <w:sz w:val="15"/>
               </w:rPr>
+              <w:t>Assistant Professor</w:t>
             </w:r>
           </w:p>
         </w:tc>
@@ -12019,6 +12023,7 @@
                 <w:color w:val="475569"/>
                 <w:sz w:val="15"/>
               </w:rPr>
+              <w:t>Department of Computer Science and Engineering</w:t>
             </w:r>
           </w:p>
         </w:tc>
@@ -12110,6 +12115,7 @@
                 <w:color w:val="0F4C81"/>
                 <w:sz w:val="15"/>
               </w:rPr>
+              <w:t>Assistant Professor</w:t>
             </w:r>
           </w:p>
         </w:tc>
@@ -12131,6 +12137,7 @@
                 <w:color w:val="475569"/>
                 <w:sz w:val="15"/>
               </w:rPr>
+              <w:t>Department of Computer Science and Engineering</w:t>
             </w:r>
           </w:p>
         </w:tc>
@@ -12562,6 +12569,7 @@
                 <w:color w:val="0F4C81"/>
                 <w:sz w:val="15"/>
               </w:rPr>
+              <w:t>Associate Professor</w:t>
             </w:r>
           </w:p>
         </w:tc>
@@ -12583,6 +12591,7 @@
                 <w:color w:val="475569"/>
                 <w:sz w:val="15"/>
               </w:rPr>
+              <w:t>Department of Computer Science &amp; Engineering</w:t>
             </w:r>
           </w:p>
         </w:tc>
@@ -12626,7 +12635,7 @@
                 <w:color w:val="1E293B"/>
                 <w:sz w:val="15"/>
               </w:rPr>
-              <w:t>Department of Computer Science &amp; Engineering, Jamia Hamdard, New Delhi</w:t>
+              <w:t>Jamia Hamdard, New Delhi</w:t>
             </w:r>
           </w:p>
         </w:tc>
@@ -14197,6 +14206,7 @@
                 <w:color w:val="0F4C81"/>
                 <w:sz w:val="15"/>
               </w:rPr>
+              <w:t>Senior Assistant Professor</w:t>
             </w:r>
           </w:p>
         </w:tc>
@@ -14218,6 +14228,7 @@
                 <w:color w:val="475569"/>
                 <w:sz w:val="15"/>
               </w:rPr>
+              <w:t>School of Computing</w:t>
             </w:r>
           </w:p>
         </w:tc>
@@ -14261,7 +14272,7 @@
                 <w:color w:val="1E293B"/>
                 <w:sz w:val="15"/>
               </w:rPr>
-              <w:t>School of Computing, SASTRA Deemed University</w:t>
+              <w:t>SASTRA Deemed University, India</w:t>
             </w:r>
           </w:p>
         </w:tc>

</xml_diff>

<commit_message>
Populate full academic departments and designations for all committee members and speakers across the site
</commit_message>
<xml_diff>
--- a/ICNGCI_2027_Committee_Members.docx
+++ b/ICNGCI_2027_Committee_Members.docx
@@ -1393,7 +1393,7 @@
                 <w:color w:val="0F4C81"/>
                 <w:sz w:val="15"/>
               </w:rPr>
-              <w:t>Associate Professor, Dr</w:t>
+              <w:t>Associate Professor &amp; Dean</w:t>
             </w:r>
           </w:p>
         </w:tc>
@@ -1415,6 +1415,7 @@
                 <w:color w:val="475569"/>
                 <w:sz w:val="15"/>
               </w:rPr>
+              <w:t>Faculty of Information Technology</w:t>
             </w:r>
           </w:p>
         </w:tc>
@@ -1458,7 +1459,7 @@
                 <w:color w:val="1E293B"/>
                 <w:sz w:val="15"/>
               </w:rPr>
-              <w:t>Haiphong University</w:t>
+              <w:t>Haiphong University, Vietnam</w:t>
             </w:r>
           </w:p>
         </w:tc>
@@ -1528,6 +1529,7 @@
                 <w:color w:val="475569"/>
                 <w:sz w:val="15"/>
               </w:rPr>
+              <w:t>Department of Physics, Faculty of Sciences</w:t>
             </w:r>
           </w:p>
         </w:tc>
@@ -1571,7 +1573,7 @@
                 <w:color w:val="1E293B"/>
                 <w:sz w:val="15"/>
               </w:rPr>
-              <w:t>Skikda university</w:t>
+              <w:t>Skikda University, Algeria</w:t>
             </w:r>
           </w:p>
         </w:tc>
@@ -1641,6 +1643,7 @@
                 <w:color w:val="475569"/>
                 <w:sz w:val="15"/>
               </w:rPr>
+              <w:t>Department of Computer Science, Modeling, Electronics and Systems Engineering</w:t>
             </w:r>
           </w:p>
         </w:tc>
@@ -1921,6 +1924,7 @@
                 <w:color w:val="475569"/>
                 <w:sz w:val="15"/>
               </w:rPr>
+              <w:t>Office of the Vice Chancellor</w:t>
             </w:r>
           </w:p>
         </w:tc>
@@ -2201,6 +2205,7 @@
                 <w:color w:val="475569"/>
                 <w:sz w:val="15"/>
               </w:rPr>
+              <w:t>Office of the Pro-Vice Chancellor</w:t>
             </w:r>
           </w:p>
         </w:tc>
@@ -3385,6 +3390,7 @@
                 <w:color w:val="475569"/>
                 <w:sz w:val="15"/>
               </w:rPr>
+              <w:t>Directorate of Educational Technology and Innovation</w:t>
             </w:r>
           </w:p>
         </w:tc>
@@ -3498,6 +3504,7 @@
                 <w:color w:val="475569"/>
                 <w:sz w:val="15"/>
               </w:rPr>
+              <w:t>Department of Mathematics and Informatics</w:t>
             </w:r>
           </w:p>
         </w:tc>
@@ -3541,7 +3548,7 @@
                 <w:color w:val="1E293B"/>
                 <w:sz w:val="15"/>
               </w:rPr>
-              <w:t>Jan Dlugosz University in Czestochowa</w:t>
+              <w:t>Jan Dlugosz University in Czestochowa, Poland</w:t>
             </w:r>
           </w:p>
         </w:tc>
@@ -3589,7 +3596,7 @@
                 <w:color w:val="0F4C81"/>
                 <w:sz w:val="15"/>
               </w:rPr>
-              <w:t>Head of Mechanical Engineering Department</w:t>
+              <w:t>Head of Department</w:t>
             </w:r>
           </w:p>
         </w:tc>
@@ -3611,6 +3618,7 @@
                 <w:color w:val="475569"/>
                 <w:sz w:val="15"/>
               </w:rPr>
+              <w:t>Department of Mechanical Engineering</w:t>
             </w:r>
           </w:p>
         </w:tc>
@@ -3654,7 +3662,7 @@
                 <w:color w:val="1E293B"/>
                 <w:sz w:val="15"/>
               </w:rPr>
-              <w:t>Aydin Adnan Menderes University</w:t>
+              <w:t>Aydin Adnan Menderes University, Turkiye</w:t>
             </w:r>
           </w:p>
         </w:tc>
@@ -3702,7 +3710,7 @@
                 <w:color w:val="0F4C81"/>
                 <w:sz w:val="15"/>
               </w:rPr>
-              <w:t>ASSOCIATE PROFESSOR</w:t>
+              <w:t>Associate Professor</w:t>
             </w:r>
           </w:p>
         </w:tc>
@@ -3724,6 +3732,7 @@
                 <w:color w:val="475569"/>
                 <w:sz w:val="15"/>
               </w:rPr>
+              <w:t>Faculty of Artificial Intelligence</w:t>
             </w:r>
           </w:p>
         </w:tc>
@@ -3767,7 +3776,7 @@
                 <w:color w:val="1E293B"/>
                 <w:sz w:val="15"/>
               </w:rPr>
-              <w:t>UNIVERSITI TEKNOLOGI MALAYSIA</w:t>
+              <w:t>Universiti Teknologi Malaysia, Malaysia</w:t>
             </w:r>
           </w:p>
         </w:tc>
@@ -3815,7 +3824,7 @@
                 <w:color w:val="0F4C81"/>
                 <w:sz w:val="15"/>
               </w:rPr>
-              <w:t>Professor, Program Director</w:t>
+              <w:t>Professor &amp; Program Director</w:t>
             </w:r>
           </w:p>
         </w:tc>
@@ -3837,6 +3846,7 @@
                 <w:color w:val="475569"/>
                 <w:sz w:val="15"/>
               </w:rPr>
+              <w:t>Department of Electrical and Computer Engineering</w:t>
             </w:r>
           </w:p>
         </w:tc>
@@ -3880,7 +3890,7 @@
                 <w:color w:val="1E293B"/>
                 <w:sz w:val="15"/>
               </w:rPr>
-              <w:t>Northeastern University, University of Massachusetts Lowell</w:t>
+              <w:t>Northeastern University, USA</w:t>
             </w:r>
           </w:p>
         </w:tc>
@@ -3928,7 +3938,7 @@
                 <w:color w:val="0F4C81"/>
                 <w:sz w:val="15"/>
               </w:rPr>
-              <w:t>Vice Dean - Deanship of Scientific Research and Innovation</w:t>
+              <w:t>Vice Dean - Scientific Research &amp; Professor</w:t>
             </w:r>
           </w:p>
         </w:tc>
@@ -3950,6 +3960,7 @@
                 <w:color w:val="475569"/>
                 <w:sz w:val="15"/>
               </w:rPr>
+              <w:t>Faculty of Engineering</w:t>
             </w:r>
           </w:p>
         </w:tc>
@@ -3993,7 +4004,7 @@
                 <w:color w:val="1E293B"/>
                 <w:sz w:val="15"/>
               </w:rPr>
-              <w:t>Al-Balqa Applied University</w:t>
+              <w:t>Al-Balqa Applied University, Jordan</w:t>
             </w:r>
           </w:p>
         </w:tc>
@@ -4041,7 +4052,7 @@
                 <w:color w:val="0F4C81"/>
                 <w:sz w:val="15"/>
               </w:rPr>
-              <w:t>Prof.</w:t>
+              <w:t>Professor</w:t>
             </w:r>
           </w:p>
         </w:tc>
@@ -4063,6 +4074,7 @@
                 <w:color w:val="475569"/>
                 <w:sz w:val="15"/>
               </w:rPr>
+              <w:t>School of Technology and Management</w:t>
             </w:r>
           </w:p>
         </w:tc>
@@ -4106,7 +4118,7 @@
                 <w:color w:val="1E293B"/>
                 <w:sz w:val="15"/>
               </w:rPr>
-              <w:t>Portalegre Polytechnic University</w:t>
+              <w:t>Portalegre Polytechnic University, Portugal</w:t>
             </w:r>
           </w:p>
         </w:tc>
@@ -4176,6 +4188,7 @@
                 <w:color w:val="475569"/>
                 <w:sz w:val="15"/>
               </w:rPr>
+              <w:t>College of Computer and Information Sciences</w:t>
             </w:r>
           </w:p>
         </w:tc>
@@ -4219,7 +4232,7 @@
                 <w:color w:val="1E293B"/>
                 <w:sz w:val="15"/>
               </w:rPr>
-              <w:t>Prince Sultan University</w:t>
+              <w:t>Prince Sultan University, Saudi Arabia</w:t>
             </w:r>
           </w:p>
         </w:tc>
@@ -4289,6 +4302,7 @@
                 <w:color w:val="475569"/>
                 <w:sz w:val="15"/>
               </w:rPr>
+              <w:t>Department of Mathematics &amp; Computer Science</w:t>
             </w:r>
           </w:p>
         </w:tc>
@@ -4332,7 +4346,7 @@
                 <w:color w:val="1E293B"/>
                 <w:sz w:val="15"/>
               </w:rPr>
-              <w:t>Brandon University</w:t>
+              <w:t>Brandon University, Canada</w:t>
             </w:r>
           </w:p>
         </w:tc>
@@ -4402,6 +4416,7 @@
                 <w:color w:val="475569"/>
                 <w:sz w:val="15"/>
               </w:rPr>
+              <w:t>School of Computer Science and Artificial Intelligence</w:t>
             </w:r>
           </w:p>
         </w:tc>
@@ -4445,7 +4460,7 @@
                 <w:color w:val="1E293B"/>
                 <w:sz w:val="15"/>
               </w:rPr>
-              <w:t>Shandong Normal University</w:t>
+              <w:t>Shandong Normal University, China</w:t>
             </w:r>
           </w:p>
         </w:tc>
@@ -4607,7 +4622,7 @@
                 <w:color w:val="0F4C81"/>
                 <w:sz w:val="15"/>
               </w:rPr>
-              <w:t>AI Institute Director/ Full Professor</w:t>
+              <w:t>AI Institute Director &amp; Full Professor</w:t>
             </w:r>
           </w:p>
         </w:tc>
@@ -4629,6 +4644,7 @@
                 <w:color w:val="475569"/>
                 <w:sz w:val="15"/>
               </w:rPr>
+              <w:t>Faculty of Engineering and Sciences</w:t>
             </w:r>
           </w:p>
         </w:tc>
@@ -4672,7 +4688,7 @@
                 <w:color w:val="1E293B"/>
                 <w:sz w:val="15"/>
               </w:rPr>
-              <w:t>Universidad Autónoma de Tamaulipas</w:t>
+              <w:t>Universidad Autónoma de Tamaulipas, Mexico</w:t>
             </w:r>
           </w:p>
         </w:tc>
@@ -4720,7 +4736,7 @@
                 <w:color w:val="0F4C81"/>
                 <w:sz w:val="15"/>
               </w:rPr>
-              <w:t>Head of department finance and banking techniques</w:t>
+              <w:t>Head of Department</w:t>
             </w:r>
           </w:p>
         </w:tc>
@@ -4742,6 +4758,7 @@
                 <w:color w:val="475569"/>
                 <w:sz w:val="15"/>
               </w:rPr>
+              <w:t>Department of Finance and Banking Techniques</w:t>
             </w:r>
           </w:p>
         </w:tc>
@@ -4785,7 +4802,7 @@
                 <w:color w:val="1E293B"/>
                 <w:sz w:val="15"/>
               </w:rPr>
-              <w:t>Middle Technical University/ institute of administration Rusafa</w:t>
+              <w:t>Middle Technical University, Iraq</w:t>
             </w:r>
           </w:p>
         </w:tc>
@@ -4855,6 +4872,7 @@
                 <w:color w:val="475569"/>
                 <w:sz w:val="15"/>
               </w:rPr>
+              <w:t>Department of Computer Science &amp; Information Technology</w:t>
             </w:r>
           </w:p>
         </w:tc>
@@ -4968,6 +4986,7 @@
                 <w:color w:val="475569"/>
                 <w:sz w:val="15"/>
               </w:rPr>
+              <w:t>Department of Engineering</w:t>
             </w:r>
           </w:p>
         </w:tc>
@@ -5011,7 +5030,7 @@
                 <w:color w:val="1E293B"/>
                 <w:sz w:val="15"/>
               </w:rPr>
-              <w:t>La Trobe University, Melbourne</w:t>
+              <w:t>La Trobe University, Melbourne, Australia</w:t>
             </w:r>
           </w:p>
         </w:tc>
@@ -5059,7 +5078,7 @@
                 <w:color w:val="0F4C81"/>
                 <w:sz w:val="15"/>
               </w:rPr>
-              <w:t>Associate profesaor</w:t>
+              <w:t>Associate Professor</w:t>
             </w:r>
           </w:p>
         </w:tc>
@@ -5081,6 +5100,7 @@
                 <w:color w:val="475569"/>
                 <w:sz w:val="15"/>
               </w:rPr>
+              <w:t>Department of Computer Science and Digital Technology</w:t>
             </w:r>
           </w:p>
         </w:tc>
@@ -5124,7 +5144,7 @@
                 <w:color w:val="1E293B"/>
                 <w:sz w:val="15"/>
               </w:rPr>
-              <w:t>Birmingham city university uk</w:t>
+              <w:t>Birmingham City University, UK</w:t>
             </w:r>
           </w:p>
         </w:tc>
@@ -5194,6 +5214,7 @@
                 <w:color w:val="475569"/>
                 <w:sz w:val="15"/>
               </w:rPr>
+              <w:t>Golisano College of Computing and Information Sciences</w:t>
             </w:r>
           </w:p>
         </w:tc>
@@ -5237,7 +5258,7 @@
                 <w:color w:val="1E293B"/>
                 <w:sz w:val="15"/>
               </w:rPr>
-              <w:t>Rochester Institute of Technology</w:t>
+              <w:t>Rochester Institute of Technology, USA</w:t>
             </w:r>
           </w:p>
         </w:tc>
@@ -5307,6 +5328,7 @@
                 <w:color w:val="475569"/>
                 <w:sz w:val="15"/>
               </w:rPr>
+              <w:t>School of Computing and Artificial Intelligence</w:t>
             </w:r>
           </w:p>
         </w:tc>
@@ -5350,7 +5372,7 @@
                 <w:color w:val="1E293B"/>
                 <w:sz w:val="15"/>
               </w:rPr>
-              <w:t>Sunway University</w:t>
+              <w:t>Sunway University, Malaysia</w:t>
             </w:r>
           </w:p>
         </w:tc>
@@ -5398,7 +5420,7 @@
                 <w:color w:val="0F4C81"/>
                 <w:sz w:val="15"/>
               </w:rPr>
-              <w:t>Lecturer/ Researcher</w:t>
+              <w:t>Associate Professor &amp; Researcher</w:t>
             </w:r>
           </w:p>
         </w:tc>
@@ -5420,6 +5442,7 @@
                 <w:color w:val="475569"/>
                 <w:sz w:val="15"/>
               </w:rPr>
+              <w:t>Faculty of Applied Social Sciences</w:t>
             </w:r>
           </w:p>
         </w:tc>
@@ -5463,7 +5486,7 @@
                 <w:color w:val="1E293B"/>
                 <w:sz w:val="15"/>
               </w:rPr>
-              <w:t>Universiti Sultan Zainal Abidin</w:t>
+              <w:t>Universiti Sultan Zainal Abidin, Malaysia</w:t>
             </w:r>
           </w:p>
         </w:tc>
@@ -5737,7 +5760,7 @@
                 <w:color w:val="0F4C81"/>
                 <w:sz w:val="15"/>
               </w:rPr>
-              <w:t>Prof. (PhD)</w:t>
+              <w:t>Professor</w:t>
             </w:r>
           </w:p>
         </w:tc>
@@ -5759,6 +5782,7 @@
                 <w:color w:val="475569"/>
                 <w:sz w:val="15"/>
               </w:rPr>
+              <w:t>Department of Mechanical Engineering</w:t>
             </w:r>
           </w:p>
         </w:tc>
@@ -5802,7 +5826,7 @@
                 <w:color w:val="1E293B"/>
                 <w:sz w:val="15"/>
               </w:rPr>
-              <w:t>University of Technology- Iraq</w:t>
+              <w:t>University of Technology, Iraq</w:t>
             </w:r>
           </w:p>
         </w:tc>
@@ -5872,6 +5896,7 @@
                 <w:color w:val="475569"/>
                 <w:sz w:val="15"/>
               </w:rPr>
+              <w:t>College of Computer Science and Engineering</w:t>
             </w:r>
           </w:p>
         </w:tc>
@@ -5915,7 +5940,7 @@
                 <w:color w:val="1E293B"/>
                 <w:sz w:val="15"/>
               </w:rPr>
-              <w:t>College of Computer Science, Taibah University</w:t>
+              <w:t>Taibah University, Saudi Arabia</w:t>
             </w:r>
           </w:p>
         </w:tc>
@@ -5985,6 +6010,7 @@
                 <w:color w:val="475569"/>
                 <w:sz w:val="15"/>
               </w:rPr>
+              <w:t>Department of Computer Science</w:t>
             </w:r>
           </w:p>
         </w:tc>
@@ -6028,7 +6054,7 @@
                 <w:color w:val="1E293B"/>
                 <w:sz w:val="15"/>
               </w:rPr>
-              <w:t>Federal Polytechnic Ayede</w:t>
+              <w:t>Federal Polytechnic Ayede, Nigeria</w:t>
             </w:r>
           </w:p>
         </w:tc>
@@ -6076,7 +6102,7 @@
                 <w:color w:val="0F4C81"/>
                 <w:sz w:val="15"/>
               </w:rPr>
-              <w:t>Catedra Professor and Post Doctoral Researcher</w:t>
+              <w:t>Catedra Professor and Postdoctoral Researcher</w:t>
             </w:r>
           </w:p>
         </w:tc>
@@ -6098,6 +6124,7 @@
                 <w:color w:val="475569"/>
                 <w:sz w:val="15"/>
               </w:rPr>
+              <w:t>School of Engineering and Sciences</w:t>
             </w:r>
           </w:p>
         </w:tc>
@@ -6189,7 +6216,7 @@
                 <w:color w:val="0F4C81"/>
                 <w:sz w:val="15"/>
               </w:rPr>
-              <w:t>Associate Professor/ University of Carthage</w:t>
+              <w:t>Associate Professor</w:t>
             </w:r>
           </w:p>
         </w:tc>
@@ -6211,6 +6238,7 @@
                 <w:color w:val="475569"/>
                 <w:sz w:val="15"/>
               </w:rPr>
+              <w:t>National Institute of Applied Science and Technology (INSAT)</w:t>
             </w:r>
           </w:p>
         </w:tc>
@@ -6254,7 +6282,7 @@
                 <w:color w:val="1E293B"/>
                 <w:sz w:val="15"/>
               </w:rPr>
-              <w:t>National Institute of Applied Science and Technology (INSAT)/ University of Carthage</w:t>
+              <w:t>University of Carthage, Tunisia</w:t>
             </w:r>
           </w:p>
         </w:tc>
@@ -12229,7 +12257,7 @@
                 <w:color w:val="0F4C81"/>
                 <w:sz w:val="15"/>
               </w:rPr>
-              <w:t>Researcher</w:t>
+              <w:t>Postdoctoral Researcher</w:t>
             </w:r>
           </w:p>
         </w:tc>
@@ -12251,6 +12279,7 @@
                 <w:color w:val="475569"/>
                 <w:sz w:val="15"/>
               </w:rPr>
+              <w:t>Faculty of Science and Engineering</w:t>
             </w:r>
           </w:p>
         </w:tc>
@@ -12294,7 +12323,7 @@
                 <w:color w:val="1E293B"/>
                 <w:sz w:val="15"/>
               </w:rPr>
-              <w:t>Abo Akademi University</w:t>
+              <w:t>Åbo Akademi University, Finland</w:t>
             </w:r>
           </w:p>
         </w:tc>
@@ -12364,6 +12393,7 @@
                 <w:color w:val="475569"/>
                 <w:sz w:val="15"/>
               </w:rPr>
+              <w:t>Department of Computer Science</w:t>
             </w:r>
           </w:p>
         </w:tc>
@@ -12407,7 +12437,7 @@
                 <w:color w:val="1E293B"/>
                 <w:sz w:val="15"/>
               </w:rPr>
-              <w:t>Nazarbayev University, Astana</w:t>
+              <w:t>Nazarbayev University, Astana, Kazakhstan</w:t>
             </w:r>
           </w:p>
         </w:tc>
@@ -12872,6 +12902,7 @@
                 <w:color w:val="475569"/>
                 <w:sz w:val="15"/>
               </w:rPr>
+              <w:t>Independent Technology Research</w:t>
             </w:r>
           </w:p>
         </w:tc>
@@ -12915,7 +12946,7 @@
                 <w:color w:val="1E293B"/>
                 <w:sz w:val="15"/>
               </w:rPr>
-              <w:t>Independent Researcher</w:t>
+              <w:t>USA</w:t>
             </w:r>
           </w:p>
         </w:tc>
@@ -12963,7 +12994,7 @@
                 <w:color w:val="0F4C81"/>
                 <w:sz w:val="15"/>
               </w:rPr>
-              <w:t>PhD researcher</w:t>
+              <w:t>PhD Researcher</w:t>
             </w:r>
           </w:p>
         </w:tc>
@@ -12985,6 +13016,7 @@
                 <w:color w:val="475569"/>
                 <w:sz w:val="15"/>
               </w:rPr>
+              <w:t>Department of Computer Science, Faculty of Sciences Dhar El Mahraz</w:t>
             </w:r>
           </w:p>
         </w:tc>
@@ -13028,7 +13060,7 @@
                 <w:color w:val="1E293B"/>
                 <w:sz w:val="15"/>
               </w:rPr>
-              <w:t>Sidi Mohamed Ben Abdellah University, Fez. Morocco</w:t>
+              <w:t>Sidi Mohamed Ben Abdellah University, Fez, Morocco</w:t>
             </w:r>
           </w:p>
         </w:tc>
@@ -13098,6 +13130,7 @@
                 <w:color w:val="475569"/>
                 <w:sz w:val="15"/>
               </w:rPr>
+              <w:t>Amity School of Engineering and Technology</w:t>
             </w:r>
           </w:p>
         </w:tc>
@@ -13141,7 +13174,7 @@
                 <w:color w:val="1E293B"/>
                 <w:sz w:val="15"/>
               </w:rPr>
-              <w:t>Amity University Hyderabad</w:t>
+              <w:t>Amity University Hyderabad, India</w:t>
             </w:r>
           </w:p>
         </w:tc>
@@ -13189,7 +13222,7 @@
                 <w:color w:val="0F4C81"/>
                 <w:sz w:val="15"/>
               </w:rPr>
-              <w:t>PROFESSOR</w:t>
+              <w:t>Professor</w:t>
             </w:r>
           </w:p>
         </w:tc>
@@ -13211,6 +13244,7 @@
                 <w:color w:val="475569"/>
                 <w:sz w:val="15"/>
               </w:rPr>
+              <w:t>Department of Computer Science and Engineering</w:t>
             </w:r>
           </w:p>
         </w:tc>
@@ -13254,7 +13288,7 @@
                 <w:color w:val="1E293B"/>
                 <w:sz w:val="15"/>
               </w:rPr>
-              <w:t>JAYPEE INSTITUTE OF INFORMATION TECHNOLOGY</w:t>
+              <w:t>Jaypee Institute of Information Technology, Noida, India</w:t>
             </w:r>
           </w:p>
         </w:tc>
@@ -13324,6 +13358,7 @@
                 <w:color w:val="475569"/>
                 <w:sz w:val="15"/>
               </w:rPr>
+              <w:t>Department of Artificial Intelligence and Data Science</w:t>
             </w:r>
           </w:p>
         </w:tc>
@@ -13367,7 +13402,7 @@
                 <w:color w:val="1E293B"/>
                 <w:sz w:val="15"/>
               </w:rPr>
-              <w:t>Sri Ramakrishna Engineering College</w:t>
+              <w:t>Sri Ramakrishna Engineering College, Coimbatore, India</w:t>
             </w:r>
           </w:p>
         </w:tc>
@@ -13437,6 +13472,7 @@
                 <w:color w:val="475569"/>
                 <w:sz w:val="15"/>
               </w:rPr>
+              <w:t>Department of Computer Science and Engineering</w:t>
             </w:r>
           </w:p>
         </w:tc>
@@ -13480,7 +13516,7 @@
                 <w:color w:val="1E293B"/>
                 <w:sz w:val="15"/>
               </w:rPr>
-              <w:t>The Northcap university (Gurugram)</w:t>
+              <w:t>The NorthCap University, Gurugram, India</w:t>
             </w:r>
           </w:p>
         </w:tc>
@@ -13550,6 +13586,7 @@
                 <w:color w:val="475569"/>
                 <w:sz w:val="15"/>
               </w:rPr>
+              <w:t>Systems Architecture &amp; IT Consulting</w:t>
             </w:r>
           </w:p>
         </w:tc>
@@ -13593,7 +13630,7 @@
                 <w:color w:val="1E293B"/>
                 <w:sz w:val="15"/>
               </w:rPr>
-              <w:t>Harwani Systems OPC Private Limited - www.HarwaniSystems.in</w:t>
+              <w:t>Harwani Systems OPC Private Limited, India</w:t>
             </w:r>
           </w:p>
         </w:tc>
@@ -13641,7 +13678,7 @@
                 <w:color w:val="0F4C81"/>
                 <w:sz w:val="15"/>
               </w:rPr>
-              <w:t>Research scientist</w:t>
+              <w:t>Research Scientist</w:t>
             </w:r>
           </w:p>
         </w:tc>
@@ -13663,6 +13700,7 @@
                 <w:color w:val="475569"/>
                 <w:sz w:val="15"/>
               </w:rPr>
+              <w:t>Directorate of Research and Studies</w:t>
             </w:r>
           </w:p>
         </w:tc>
@@ -13706,7 +13744,7 @@
                 <w:color w:val="1E293B"/>
                 <w:sz w:val="15"/>
               </w:rPr>
-              <w:t>NIPSS kuru, Nigeria</w:t>
+              <w:t>National Institute for Policy and Strategic Studies (NIPSS), Nigeria</w:t>
             </w:r>
           </w:p>
         </w:tc>
@@ -13754,7 +13792,7 @@
                 <w:color w:val="0F4C81"/>
                 <w:sz w:val="15"/>
               </w:rPr>
-              <w:t>Professor Doctor</w:t>
+              <w:t>Professor</w:t>
             </w:r>
           </w:p>
         </w:tc>
@@ -13776,6 +13814,7 @@
                 <w:color w:val="475569"/>
                 <w:sz w:val="15"/>
               </w:rPr>
+              <w:t>Department of Electrical and Electronics Engineering</w:t>
             </w:r>
           </w:p>
         </w:tc>
@@ -13819,7 +13858,7 @@
                 <w:color w:val="1E293B"/>
                 <w:sz w:val="15"/>
               </w:rPr>
-              <w:t>Sakarya University</w:t>
+              <w:t>Sakarya University, Turkiye</w:t>
             </w:r>
           </w:p>
         </w:tc>
@@ -13867,7 +13906,7 @@
                 <w:color w:val="0F4C81"/>
                 <w:sz w:val="15"/>
               </w:rPr>
-              <w:t>Head of Cybersecurity Department</w:t>
+              <w:t>Head of Department &amp; Associate Professor</w:t>
             </w:r>
           </w:p>
         </w:tc>
@@ -13889,6 +13928,7 @@
                 <w:color w:val="475569"/>
                 <w:sz w:val="15"/>
               </w:rPr>
+              <w:t>Department of Cybersecurity</w:t>
             </w:r>
           </w:p>
         </w:tc>
@@ -13932,7 +13972,7 @@
                 <w:color w:val="1E293B"/>
                 <w:sz w:val="15"/>
               </w:rPr>
-              <w:t>Jordan University of Science and Technology</w:t>
+              <w:t>Jordan University of Science and Technology, Jordan</w:t>
             </w:r>
           </w:p>
         </w:tc>
@@ -14002,6 +14042,7 @@
                 <w:color w:val="475569"/>
                 <w:sz w:val="15"/>
               </w:rPr>
+              <w:t>Faculty of Technology &amp; Innovation</w:t>
             </w:r>
           </w:p>
         </w:tc>
@@ -14045,7 +14086,7 @@
                 <w:color w:val="1E293B"/>
                 <w:sz w:val="15"/>
               </w:rPr>
-              <w:t>Yhank Institute</w:t>
+              <w:t>Yhank Institute, Malta</w:t>
             </w:r>
           </w:p>
         </w:tc>
@@ -14115,6 +14156,7 @@
                 <w:color w:val="475569"/>
                 <w:sz w:val="15"/>
               </w:rPr>
+              <w:t>Department of Electronics and Communication Engineering</w:t>
             </w:r>
           </w:p>
         </w:tc>
@@ -14158,7 +14200,7 @@
                 <w:color w:val="1E293B"/>
                 <w:sz w:val="15"/>
               </w:rPr>
-              <w:t>Bannari Amman Institute of Technology</w:t>
+              <w:t>Bannari Amman Institute of Technology, India</w:t>
             </w:r>
           </w:p>
         </w:tc>
@@ -14320,7 +14362,7 @@
                 <w:color w:val="0F4C81"/>
                 <w:sz w:val="15"/>
               </w:rPr>
-              <w:t>Professor &amp; HOD, Dept. - CSE</w:t>
+              <w:t>Professor &amp; Head of Department</w:t>
             </w:r>
           </w:p>
         </w:tc>
@@ -14342,6 +14384,7 @@
                 <w:color w:val="475569"/>
                 <w:sz w:val="15"/>
               </w:rPr>
+              <w:t>Department of Computer Science &amp; Engineering</w:t>
             </w:r>
           </w:p>
         </w:tc>
@@ -14385,7 +14428,7 @@
                 <w:color w:val="1E293B"/>
                 <w:sz w:val="15"/>
               </w:rPr>
-              <w:t>Brainware University</w:t>
+              <w:t>Brainware University, India</w:t>
             </w:r>
           </w:p>
         </w:tc>
@@ -14455,6 +14498,7 @@
                 <w:color w:val="475569"/>
                 <w:sz w:val="15"/>
               </w:rPr>
+              <w:t>Department of Computer Science and Engineering</w:t>
             </w:r>
           </w:p>
         </w:tc>
@@ -14498,7 +14542,7 @@
                 <w:color w:val="1E293B"/>
                 <w:sz w:val="15"/>
               </w:rPr>
-              <w:t>PDEU, Gandhinagar</w:t>
+              <w:t>Pandit Deendayal Energy University (PDEU), Gandhinagar, India</w:t>
             </w:r>
           </w:p>
         </w:tc>
@@ -14568,6 +14612,7 @@
                 <w:color w:val="475569"/>
                 <w:sz w:val="15"/>
               </w:rPr>
+              <w:t>Department of Computer Science</w:t>
             </w:r>
           </w:p>
         </w:tc>
@@ -14611,7 +14656,7 @@
                 <w:color w:val="1E293B"/>
                 <w:sz w:val="15"/>
               </w:rPr>
-              <w:t>MSCB University, Odisha</w:t>
+              <w:t>Maharaja Sriram Chandra Bhanja Deo (MSCB) University, Odisha, India</w:t>
             </w:r>
           </w:p>
         </w:tc>
@@ -14681,6 +14726,7 @@
                 <w:color w:val="475569"/>
                 <w:sz w:val="15"/>
               </w:rPr>
+              <w:t>Department of Computer Science &amp; Engineering</w:t>
             </w:r>
           </w:p>
         </w:tc>
@@ -14724,7 +14770,7 @@
                 <w:color w:val="1E293B"/>
                 <w:sz w:val="15"/>
               </w:rPr>
-              <w:t>Academy of Technology</w:t>
+              <w:t>Academy of Technology, Hooghly, India</w:t>
             </w:r>
           </w:p>
         </w:tc>
@@ -14772,7 +14818,7 @@
                 <w:color w:val="0F4C81"/>
                 <w:sz w:val="15"/>
               </w:rPr>
-              <w:t>PROFESSOR</w:t>
+              <w:t>Professor</w:t>
             </w:r>
           </w:p>
         </w:tc>
@@ -14794,6 +14840,7 @@
                 <w:color w:val="475569"/>
                 <w:sz w:val="15"/>
               </w:rPr>
+              <w:t>Jindal Global Business School</w:t>
             </w:r>
           </w:p>
         </w:tc>
@@ -14837,7 +14884,7 @@
                 <w:color w:val="1E293B"/>
                 <w:sz w:val="15"/>
               </w:rPr>
-              <w:t>OP JINDAL GLOBAL UNIVERSITY</w:t>
+              <w:t>O.P. Jindal Global University, Sonipat, India</w:t>
             </w:r>
           </w:p>
         </w:tc>

</xml_diff>

<commit_message>
Synchronize Word document with latest committee designations and departments
</commit_message>
<xml_diff>
--- a/ICNGCI_2027_Committee_Members.docx
+++ b/ICNGCI_2027_Committee_Members.docx
@@ -1643,7 +1643,9 @@
                 <w:color w:val="475569"/>
                 <w:sz w:val="15"/>
               </w:rPr>
-              <w:t>Department of Computer Science, Modeling, Electronics and Systems Engineering</w:t>
+              <w:t>Department of Computer Science, Modeling, Electronics and Systems</w:t>
+              <w:br/>
+              <w:t xml:space="preserve">                      Engineering</w:t>
             </w:r>
           </w:p>
         </w:tc>
@@ -1924,7 +1926,6 @@
                 <w:color w:val="475569"/>
                 <w:sz w:val="15"/>
               </w:rPr>
-              <w:t>Office of the Vice Chancellor</w:t>
             </w:r>
           </w:p>
         </w:tc>
@@ -2183,7 +2184,7 @@
                 <w:color w:val="0F4C81"/>
                 <w:sz w:val="15"/>
               </w:rPr>
-              <w:t>Pro-Vice Chancellor</w:t>
+              <w:t>Dean</w:t>
             </w:r>
           </w:p>
         </w:tc>
@@ -2205,7 +2206,7 @@
                 <w:color w:val="475569"/>
                 <w:sz w:val="15"/>
               </w:rPr>
-              <w:t>Office of the Pro-Vice Chancellor</w:t>
+              <w:t>School of Computing Science and Engineering</w:t>
             </w:r>
           </w:p>
         </w:tc>
@@ -12902,7 +12903,7 @@
                 <w:color w:val="475569"/>
                 <w:sz w:val="15"/>
               </w:rPr>
-              <w:t>Independent Technology Research</w:t>
+              <w:t>Dell Technologies</w:t>
             </w:r>
           </w:p>
         </w:tc>

</xml_diff>